<commit_message>
updated the project settings
</commit_message>
<xml_diff>
--- a/ADLC-Agent-Kit-Installation-Guide.docx
+++ b/ADLC-Agent-Kit-Installation-Guide.docx
@@ -53,7 +53,7 @@
           <w:sz w:val="26"/>
           <w:szCs w:val="26"/>
         </w:rPr>
-        <w:t xml:space="preserve">Version 2.0 — Team Panchayat</w:t>
+        <w:t xml:space="preserve">Version 3.2 — Team Panchayat</w:t>
       </w:r>
     </w:p>
     <w:p>
@@ -1089,7 +1089,43 @@
           <w:sz w:val="22"/>
           <w:szCs w:val="22"/>
         </w:rPr>
-        <w:t xml:space="preserve">PowerShell Launcher — one-click start for all 8 windows</w:t>
+        <w:t xml:space="preserve">PowerShell Launcher — one-click start for all 8 windows (AutoRun + Interactive modes)</w:t>
+      </w:r>
+    </w:p>
+    <w:p>
+      <w:pPr>
+        <w:pStyle w:val="ListParagraph"/>
+        <w:numPr>
+          <w:ilvl w:val="0"/>
+          <w:numId w:val="2"/>
+        </w:numPr>
+        <w:spacing w:after="40" w:before="40" w:line="276"/>
+      </w:pPr>
+      <w:r>
+        <w:rPr>
+          <w:rFonts w:ascii="Arial" w:cs="Arial" w:eastAsia="Arial" w:hAnsi="Arial"/>
+          <w:sz w:val="22"/>
+          <w:szCs w:val="22"/>
+        </w:rPr>
+        <w:t xml:space="preserve">Multi-Project Queue — manage multiple requirements as separate project folders; switch between them from the sprint board or CLI</w:t>
+      </w:r>
+    </w:p>
+    <w:p>
+      <w:pPr>
+        <w:pStyle w:val="ListParagraph"/>
+        <w:numPr>
+          <w:ilvl w:val="0"/>
+          <w:numId w:val="2"/>
+        </w:numPr>
+        <w:spacing w:after="40" w:before="40" w:line="276"/>
+      </w:pPr>
+      <w:r>
+        <w:rPr>
+          <w:rFonts w:ascii="Arial" w:cs="Arial" w:eastAsia="Arial" w:hAnsi="Arial"/>
+          <w:sz w:val="22"/>
+          <w:szCs w:val="22"/>
+        </w:rPr>
+        <w:t xml:space="preserve">Model Routing — Arjun on Opus, build agents on Sonnet, design/QA on Haiku — automatically applied per agent</w:t>
       </w:r>
     </w:p>
     <w:p/>
@@ -2644,7 +2680,7 @@
           <w:sz w:val="18"/>
           <w:szCs w:val="18"/>
         </w:rPr>
-        <w:t xml:space="preserve">├── start-agents.ps1         # Launch all 8 PowerShell windows</w:t>
+        <w:t xml:space="preserve">├── start-agents.bat         # Windows batch launcher (double-click to run)</w:t>
       </w:r>
     </w:p>
     <w:p>
@@ -2868,7 +2904,55 @@
           <w:sz w:val="18"/>
           <w:szCs w:val="18"/>
         </w:rPr>
-        <w:t xml:space="preserve">├── sprint-dashboard.html    # Visual sprint dashboard</w:t>
+        <w:t xml:space="preserve">├── sprint-board.html        # Live Kanban sprint dashboard (Teams-style chat)</w:t>
+      </w:r>
+    </w:p>
+    <w:p>
+      <w:pPr>
+        <w:shd w:fill="F0F4F8" w:val="clear"/>
+        <w:spacing w:after="0" w:before="0" w:line="276"/>
+        <w:ind w:left="360"/>
+      </w:pPr>
+      <w:r>
+        <w:rPr>
+          <w:rFonts w:ascii="Courier New" w:cs="Courier New" w:eastAsia="Courier New" w:hAnsi="Courier New"/>
+          <w:color w:val="1A1A1A"/>
+          <w:sz w:val="18"/>
+          <w:szCs w:val="18"/>
+        </w:rPr>
+        <w:t xml:space="preserve">├── active-project.json      # Points to the currently active project folder</w:t>
+      </w:r>
+    </w:p>
+    <w:p>
+      <w:pPr>
+        <w:shd w:fill="F0F4F8" w:val="clear"/>
+        <w:spacing w:after="0" w:before="0" w:line="276"/>
+        <w:ind w:left="360"/>
+      </w:pPr>
+      <w:r>
+        <w:rPr>
+          <w:rFonts w:ascii="Courier New" w:cs="Courier New" w:eastAsia="Courier New" w:hAnsi="Courier New"/>
+          <w:color w:val="1A1A1A"/>
+          <w:sz w:val="18"/>
+          <w:szCs w:val="18"/>
+        </w:rPr>
+        <w:t xml:space="preserve">├── projects/                # One subfolder per requirement (multi-project)</w:t>
+      </w:r>
+    </w:p>
+    <w:p>
+      <w:pPr>
+        <w:shd w:fill="F0F4F8" w:val="clear"/>
+        <w:spacing w:after="0" w:before="0" w:line="276"/>
+        <w:ind w:left="360"/>
+      </w:pPr>
+      <w:r>
+        <w:rPr>
+          <w:rFonts w:ascii="Courier New" w:cs="Courier New" w:eastAsia="Courier New" w:hAnsi="Courier New"/>
+          <w:color w:val="1A1A1A"/>
+          <w:sz w:val="18"/>
+          <w:szCs w:val="18"/>
+        </w:rPr>
+        <w:t xml:space="preserve">│   └── REQ-xxx-name/        # requirement.json, agent-status.json, outputs</w:t>
       </w:r>
     </w:p>
     <w:p>
@@ -3801,6 +3885,186 @@
           </w:p>
         </w:tc>
       </w:tr>
+      <w:tr>
+        <w:tc>
+          <w:tcPr>
+            <w:tcW w:type="dxa" w:w="3000"/>
+            <w:tcBorders>
+              <w:top w:val="single" w:color="CCCCCC" w:sz="1"/>
+              <w:left w:val="single" w:color="CCCCCC" w:sz="1"/>
+              <w:bottom w:val="single" w:color="CCCCCC" w:sz="1"/>
+              <w:right w:val="single" w:color="CCCCCC" w:sz="1"/>
+            </w:tcBorders>
+            <w:shd w:fill="FFFFFF" w:val="clear"/>
+            <w:tcMar>
+              <w:top w:type="dxa" w:w="80"/>
+              <w:left w:type="dxa" w:w="120"/>
+              <w:bottom w:type="dxa" w:w="80"/>
+              <w:right w:type="dxa" w:w="120"/>
+            </w:tcMar>
+          </w:tcPr>
+          <w:p>
+            <w:r>
+              <w:rPr>
+                <w:rFonts w:ascii="Courier New" w:cs="Courier New" w:eastAsia="Courier New" w:hAnsi="Courier New"/>
+                <w:b/>
+                <w:bCs/>
+                <w:sz w:val="18"/>
+                <w:szCs w:val="18"/>
+              </w:rPr>
+              <w:t xml:space="preserve">GET /api/projects       </w:t>
+            </w:r>
+          </w:p>
+        </w:tc>
+        <w:tc>
+          <w:tcPr>
+            <w:tcW w:type="dxa" w:w="6360"/>
+            <w:tcBorders>
+              <w:top w:val="single" w:color="CCCCCC" w:sz="1"/>
+              <w:left w:val="single" w:color="CCCCCC" w:sz="1"/>
+              <w:bottom w:val="single" w:color="CCCCCC" w:sz="1"/>
+              <w:right w:val="single" w:color="CCCCCC" w:sz="1"/>
+            </w:tcBorders>
+            <w:shd w:fill="FFFFFF" w:val="clear"/>
+            <w:tcMar>
+              <w:top w:type="dxa" w:w="80"/>
+              <w:left w:type="dxa" w:w="120"/>
+              <w:bottom w:type="dxa" w:w="80"/>
+              <w:right w:type="dxa" w:w="120"/>
+            </w:tcMar>
+          </w:tcPr>
+          <w:p>
+            <w:r>
+              <w:rPr>
+                <w:rFonts w:ascii="Arial" w:cs="Arial" w:eastAsia="Arial" w:hAnsi="Arial"/>
+                <w:sz w:val="20"/>
+                <w:szCs w:val="20"/>
+              </w:rPr>
+              <w:t xml:space="preserve">List all projects (root + projects/ subfolders)</w:t>
+            </w:r>
+          </w:p>
+        </w:tc>
+      </w:tr>
+      <w:tr>
+        <w:tc>
+          <w:tcPr>
+            <w:tcW w:type="dxa" w:w="3000"/>
+            <w:tcBorders>
+              <w:top w:val="single" w:color="CCCCCC" w:sz="1"/>
+              <w:left w:val="single" w:color="CCCCCC" w:sz="1"/>
+              <w:bottom w:val="single" w:color="CCCCCC" w:sz="1"/>
+              <w:right w:val="single" w:color="CCCCCC" w:sz="1"/>
+            </w:tcBorders>
+            <w:shd w:fill="FFFFFF" w:val="clear"/>
+            <w:tcMar>
+              <w:top w:type="dxa" w:w="80"/>
+              <w:left w:type="dxa" w:w="120"/>
+              <w:bottom w:type="dxa" w:w="80"/>
+              <w:right w:type="dxa" w:w="120"/>
+            </w:tcMar>
+          </w:tcPr>
+          <w:p>
+            <w:r>
+              <w:rPr>
+                <w:rFonts w:ascii="Courier New" w:cs="Courier New" w:eastAsia="Courier New" w:hAnsi="Courier New"/>
+                <w:b/>
+                <w:bCs/>
+                <w:sz w:val="18"/>
+                <w:szCs w:val="18"/>
+              </w:rPr>
+              <w:t xml:space="preserve">POST /api/switch-project</w:t>
+            </w:r>
+          </w:p>
+        </w:tc>
+        <w:tc>
+          <w:tcPr>
+            <w:tcW w:type="dxa" w:w="6360"/>
+            <w:tcBorders>
+              <w:top w:val="single" w:color="CCCCCC" w:sz="1"/>
+              <w:left w:val="single" w:color="CCCCCC" w:sz="1"/>
+              <w:bottom w:val="single" w:color="CCCCCC" w:sz="1"/>
+              <w:right w:val="single" w:color="CCCCCC" w:sz="1"/>
+            </w:tcBorders>
+            <w:shd w:fill="FFFFFF" w:val="clear"/>
+            <w:tcMar>
+              <w:top w:type="dxa" w:w="80"/>
+              <w:left w:type="dxa" w:w="120"/>
+              <w:bottom w:type="dxa" w:w="80"/>
+              <w:right w:type="dxa" w:w="120"/>
+            </w:tcMar>
+          </w:tcPr>
+          <w:p>
+            <w:r>
+              <w:rPr>
+                <w:rFonts w:ascii="Arial" w:cs="Arial" w:eastAsia="Arial" w:hAnsi="Arial"/>
+                <w:sz w:val="20"/>
+                <w:szCs w:val="20"/>
+              </w:rPr>
+              <w:t xml:space="preserve">Switch active project — body: { "path": "projects/REQ-xxx" }</w:t>
+            </w:r>
+          </w:p>
+        </w:tc>
+      </w:tr>
+      <w:tr>
+        <w:tc>
+          <w:tcPr>
+            <w:tcW w:type="dxa" w:w="3000"/>
+            <w:tcBorders>
+              <w:top w:val="single" w:color="CCCCCC" w:sz="1"/>
+              <w:left w:val="single" w:color="CCCCCC" w:sz="1"/>
+              <w:bottom w:val="single" w:color="CCCCCC" w:sz="1"/>
+              <w:right w:val="single" w:color="CCCCCC" w:sz="1"/>
+            </w:tcBorders>
+            <w:shd w:fill="FFFFFF" w:val="clear"/>
+            <w:tcMar>
+              <w:top w:type="dxa" w:w="80"/>
+              <w:left w:type="dxa" w:w="120"/>
+              <w:bottom w:type="dxa" w:w="80"/>
+              <w:right w:type="dxa" w:w="120"/>
+            </w:tcMar>
+          </w:tcPr>
+          <w:p>
+            <w:r>
+              <w:rPr>
+                <w:rFonts w:ascii="Courier New" w:cs="Courier New" w:eastAsia="Courier New" w:hAnsi="Courier New"/>
+                <w:b/>
+                <w:bCs/>
+                <w:sz w:val="18"/>
+                <w:szCs w:val="18"/>
+              </w:rPr>
+              <w:t xml:space="preserve">POST /api/next-project  </w:t>
+            </w:r>
+          </w:p>
+        </w:tc>
+        <w:tc>
+          <w:tcPr>
+            <w:tcW w:type="dxa" w:w="6360"/>
+            <w:tcBorders>
+              <w:top w:val="single" w:color="CCCCCC" w:sz="1"/>
+              <w:left w:val="single" w:color="CCCCCC" w:sz="1"/>
+              <w:bottom w:val="single" w:color="CCCCCC" w:sz="1"/>
+              <w:right w:val="single" w:color="CCCCCC" w:sz="1"/>
+            </w:tcBorders>
+            <w:shd w:fill="FFFFFF" w:val="clear"/>
+            <w:tcMar>
+              <w:top w:type="dxa" w:w="80"/>
+              <w:left w:type="dxa" w:w="120"/>
+              <w:bottom w:type="dxa" w:w="80"/>
+              <w:right w:type="dxa" w:w="120"/>
+            </w:tcMar>
+          </w:tcPr>
+          <w:p>
+            <w:r>
+              <w:rPr>
+                <w:rFonts w:ascii="Arial" w:cs="Arial" w:eastAsia="Arial" w:hAnsi="Arial"/>
+                <w:sz w:val="20"/>
+                <w:szCs w:val="20"/>
+              </w:rPr>
+              <w:t xml:space="preserve">Scaffold new project folder and switch to it</w:t>
+            </w:r>
+          </w:p>
+        </w:tc>
+      </w:tr>
     </w:tbl>
     <w:p/>
     <w:p>
@@ -3834,7 +4098,7 @@
           <w:sz w:val="22"/>
           <w:szCs w:val="22"/>
         </w:rPr>
-        <w:t xml:space="preserve">The start-agents.ps1 launcher starts the dashboard server automatically as one of the 8 windows. You do not need to start it manually.</w:t>
+        <w:t xml:space="preserve">The start-agents.bat launcher starts the dashboard server automatically in all modes. You do not need to start it manually.</w:t>
       </w:r>
     </w:p>
     <w:p/>
@@ -5750,7 +6014,7 @@
           <w:sz w:val="18"/>
           <w:szCs w:val="18"/>
         </w:rPr>
-        <w:t xml:space="preserve">node new-project.js</w:t>
+        <w:t xml:space="preserve">start-agents.bat new</w:t>
       </w:r>
     </w:p>
     <w:p>
@@ -5767,7 +6031,7 @@
           <w:sz w:val="22"/>
           <w:szCs w:val="22"/>
         </w:rPr>
-        <w:t xml:space="preserve">The wizard asks you for:</w:t>
+        <w:t xml:space="preserve">This creates a new project subfolder under projects\REQ-xxx-name\ and switches the active project pointer automatically. The wizard asks you for:</w:t>
       </w:r>
     </w:p>
     <w:p>
@@ -6445,6 +6709,126 @@
                 <w:szCs w:val="20"/>
               </w:rPr>
               <w:t xml:space="preserve">Approve the sprint plan — agents move from queue to in-progress</w:t>
+            </w:r>
+          </w:p>
+        </w:tc>
+      </w:tr>
+      <w:tr>
+        <w:tc>
+          <w:tcPr>
+            <w:tcW w:type="dxa" w:w="3000"/>
+            <w:tcBorders>
+              <w:top w:val="single" w:color="CCCCCC" w:sz="1"/>
+              <w:left w:val="single" w:color="CCCCCC" w:sz="1"/>
+              <w:bottom w:val="single" w:color="CCCCCC" w:sz="1"/>
+              <w:right w:val="single" w:color="CCCCCC" w:sz="1"/>
+            </w:tcBorders>
+            <w:shd w:fill="F5F5F5" w:val="clear"/>
+            <w:tcMar>
+              <w:top w:type="dxa" w:w="80"/>
+              <w:left w:type="dxa" w:w="120"/>
+              <w:bottom w:type="dxa" w:w="80"/>
+              <w:right w:type="dxa" w:w="120"/>
+            </w:tcMar>
+          </w:tcPr>
+          <w:p>
+            <w:r>
+              <w:rPr>
+                <w:rFonts w:ascii="Courier New" w:cs="Courier New" w:eastAsia="Courier New" w:hAnsi="Courier New"/>
+                <w:b/>
+                <w:bCs/>
+                <w:sz w:val="18"/>
+                <w:szCs w:val="18"/>
+              </w:rPr>
+              <w:t xml:space="preserve">node new-project.js --list</w:t>
+            </w:r>
+          </w:p>
+        </w:tc>
+        <w:tc>
+          <w:tcPr>
+            <w:tcW w:type="dxa" w:w="6360"/>
+            <w:tcBorders>
+              <w:top w:val="single" w:color="CCCCCC" w:sz="1"/>
+              <w:left w:val="single" w:color="CCCCCC" w:sz="1"/>
+              <w:bottom w:val="single" w:color="CCCCCC" w:sz="1"/>
+              <w:right w:val="single" w:color="CCCCCC" w:sz="1"/>
+            </w:tcBorders>
+            <w:shd w:fill="F5F5F5" w:val="clear"/>
+            <w:tcMar>
+              <w:top w:type="dxa" w:w="80"/>
+              <w:left w:type="dxa" w:w="120"/>
+              <w:bottom w:type="dxa" w:w="80"/>
+              <w:right w:type="dxa" w:w="120"/>
+            </w:tcMar>
+          </w:tcPr>
+          <w:p>
+            <w:r>
+              <w:rPr>
+                <w:rFonts w:ascii="Arial" w:cs="Arial" w:eastAsia="Arial" w:hAnsi="Arial"/>
+                <w:sz w:val="20"/>
+                <w:szCs w:val="20"/>
+              </w:rPr>
+              <w:t xml:space="preserve">List all project subfolders in the projects\ queue with their status</w:t>
+            </w:r>
+          </w:p>
+        </w:tc>
+      </w:tr>
+      <w:tr>
+        <w:tc>
+          <w:tcPr>
+            <w:tcW w:type="dxa" w:w="3000"/>
+            <w:tcBorders>
+              <w:top w:val="single" w:color="CCCCCC" w:sz="1"/>
+              <w:left w:val="single" w:color="CCCCCC" w:sz="1"/>
+              <w:bottom w:val="single" w:color="CCCCCC" w:sz="1"/>
+              <w:right w:val="single" w:color="CCCCCC" w:sz="1"/>
+            </w:tcBorders>
+            <w:shd w:fill="FFFFFF" w:val="clear"/>
+            <w:tcMar>
+              <w:top w:type="dxa" w:w="80"/>
+              <w:left w:type="dxa" w:w="120"/>
+              <w:bottom w:type="dxa" w:w="80"/>
+              <w:right w:type="dxa" w:w="120"/>
+            </w:tcMar>
+          </w:tcPr>
+          <w:p>
+            <w:r>
+              <w:rPr>
+                <w:rFonts w:ascii="Courier New" w:cs="Courier New" w:eastAsia="Courier New" w:hAnsi="Courier New"/>
+                <w:b/>
+                <w:bCs/>
+                <w:sz w:val="18"/>
+                <w:szCs w:val="18"/>
+              </w:rPr>
+              <w:t xml:space="preserve">node new-project.js --switch "projects\REQ-xxx"</w:t>
+            </w:r>
+          </w:p>
+        </w:tc>
+        <w:tc>
+          <w:tcPr>
+            <w:tcW w:type="dxa" w:w="6360"/>
+            <w:tcBorders>
+              <w:top w:val="single" w:color="CCCCCC" w:sz="1"/>
+              <w:left w:val="single" w:color="CCCCCC" w:sz="1"/>
+              <w:bottom w:val="single" w:color="CCCCCC" w:sz="1"/>
+              <w:right w:val="single" w:color="CCCCCC" w:sz="1"/>
+            </w:tcBorders>
+            <w:shd w:fill="FFFFFF" w:val="clear"/>
+            <w:tcMar>
+              <w:top w:type="dxa" w:w="80"/>
+              <w:left w:type="dxa" w:w="120"/>
+              <w:bottom w:type="dxa" w:w="80"/>
+              <w:right w:type="dxa" w:w="120"/>
+            </w:tcMar>
+          </w:tcPr>
+          <w:p>
+            <w:r>
+              <w:rPr>
+                <w:rFonts w:ascii="Arial" w:cs="Arial" w:eastAsia="Arial" w:hAnsi="Arial"/>
+                <w:sz w:val="20"/>
+                <w:szCs w:val="20"/>
+              </w:rPr>
+              <w:t xml:space="preserve">Switch the active project pointer to a specific subfolder; dashboard and agents reload automatically</w:t>
             </w:r>
           </w:p>
         </w:tc>
@@ -8533,39 +8917,119 @@
           <w:sz w:val="22"/>
           <w:szCs w:val="22"/>
         </w:rPr>
-        <w:t xml:space="preserve">This single PowerShell command launches all 8 windows:</w:t>
-      </w:r>
-    </w:p>
-    <w:p>
-      <w:pPr>
-        <w:shd w:fill="F0F4F8" w:val="clear"/>
-        <w:spacing w:after="0" w:before="0" w:line="276"/>
-        <w:ind w:left="360"/>
-      </w:pPr>
-      <w:r>
-        <w:rPr>
-          <w:rFonts w:ascii="Courier New" w:cs="Courier New" w:eastAsia="Courier New" w:hAnsi="Courier New"/>
-          <w:color w:val="1A1A1A"/>
-          <w:sz w:val="18"/>
-          <w:szCs w:val="18"/>
-        </w:rPr>
-        <w:t xml:space="preserve">cd $env:USERPROFILE\Downloads\ADLC-Agent-Kit</w:t>
-      </w:r>
-    </w:p>
-    <w:p>
-      <w:pPr>
-        <w:shd w:fill="F0F4F8" w:val="clear"/>
-        <w:spacing w:after="0" w:before="0" w:line="276"/>
-        <w:ind w:left="360"/>
-      </w:pPr>
-      <w:r>
-        <w:rPr>
-          <w:rFonts w:ascii="Courier New" w:cs="Courier New" w:eastAsia="Courier New" w:hAnsi="Courier New"/>
-          <w:color w:val="1A1A1A"/>
-          <w:sz w:val="18"/>
-          <w:szCs w:val="18"/>
-        </w:rPr>
-        <w:t xml:space="preserve">.\start-agents.ps1</w:t>
+        <w:t xml:space="preserve">Double-click start-agents.bat in the ADLC-Agent-Kit folder, or run one of these commands:</w:t>
+      </w:r>
+    </w:p>
+    <w:p>
+      <w:pPr>
+        <w:shd w:fill="F0F4F8" w:val="clear"/>
+        <w:spacing w:after="0" w:before="0" w:line="276"/>
+        <w:ind w:left="360"/>
+      </w:pPr>
+      <w:r>
+        <w:rPr>
+          <w:rFonts w:ascii="Courier New" w:cs="Courier New" w:eastAsia="Courier New" w:hAnsi="Courier New"/>
+          <w:color w:val="1A1A1A"/>
+          <w:sz w:val="18"/>
+          <w:szCs w:val="18"/>
+        </w:rPr>
+        <w:t xml:space="preserve">start-agents.bat              # interactive (paste prompts manually)</w:t>
+      </w:r>
+    </w:p>
+    <w:p>
+      <w:pPr>
+        <w:shd w:fill="F0F4F8" w:val="clear"/>
+        <w:spacing w:after="0" w:before="0" w:line="276"/>
+        <w:ind w:left="360"/>
+      </w:pPr>
+      <w:r>
+        <w:rPr>
+          <w:rFonts w:ascii="Courier New" w:cs="Courier New" w:eastAsia="Courier New" w:hAnsi="Courier New"/>
+          <w:color w:val="1A1A1A"/>
+          <w:sz w:val="18"/>
+          <w:szCs w:val="18"/>
+        </w:rPr>
+        <w:t xml:space="preserve">start-agents.bat autorun      # fully autonomous (compile + parallel launch)</w:t>
+      </w:r>
+    </w:p>
+    <w:p>
+      <w:pPr>
+        <w:shd w:fill="F0F4F8" w:val="clear"/>
+        <w:spacing w:after="0" w:before="0" w:line="276"/>
+        <w:ind w:left="360"/>
+      </w:pPr>
+      <w:r>
+        <w:rPr>
+          <w:rFonts w:ascii="Courier New" w:cs="Courier New" w:eastAsia="Courier New" w:hAnsi="Courier New"/>
+          <w:color w:val="1A1A1A"/>
+          <w:sz w:val="18"/>
+          <w:szCs w:val="18"/>
+        </w:rPr>
+        <w:t xml:space="preserve">start-agents.bat autorun vikram   # autorun a single agent only</w:t>
+      </w:r>
+    </w:p>
+    <w:p>
+      <w:pPr>
+        <w:shd w:fill="F0F4F8" w:val="clear"/>
+        <w:spacing w:after="0" w:before="0" w:line="276"/>
+        <w:ind w:left="360"/>
+      </w:pPr>
+      <w:r>
+        <w:rPr>
+          <w:rFonts w:ascii="Courier New" w:cs="Courier New" w:eastAsia="Courier New" w:hAnsi="Courier New"/>
+          <w:color w:val="1A1A1A"/>
+          <w:sz w:val="18"/>
+          <w:szCs w:val="18"/>
+        </w:rPr>
+        <w:t xml:space="preserve">start-agents.bat project "projects\REQ-xxx" autorun   # run a specific project</w:t>
+      </w:r>
+    </w:p>
+    <w:p>
+      <w:pPr>
+        <w:shd w:fill="F0F4F8" w:val="clear"/>
+        <w:spacing w:after="0" w:before="0" w:line="276"/>
+        <w:ind w:left="360"/>
+      </w:pPr>
+      <w:r>
+        <w:rPr>
+          <w:rFonts w:ascii="Courier New" w:cs="Courier New" w:eastAsia="Courier New" w:hAnsi="Courier New"/>
+          <w:color w:val="1A1A1A"/>
+          <w:sz w:val="18"/>
+          <w:szCs w:val="18"/>
+        </w:rPr>
+        <w:t xml:space="preserve">start-agents.bat new          # create a new requirement (wizard)</w:t>
+      </w:r>
+    </w:p>
+    <w:p>
+      <w:pPr>
+        <w:shd w:fill="F0F4F8" w:val="clear"/>
+        <w:spacing w:after="0" w:before="0" w:line="276"/>
+        <w:ind w:left="360"/>
+      </w:pPr>
+      <w:r>
+        <w:rPr>
+          <w:rFonts w:ascii="Courier New" w:cs="Courier New" w:eastAsia="Courier New" w:hAnsi="Courier New"/>
+          <w:color w:val="1A1A1A"/>
+          <w:sz w:val="18"/>
+          <w:szCs w:val="18"/>
+        </w:rPr>
+        <w:t xml:space="preserve">start-agents.bat list         # list all projects in the queue</w:t>
+      </w:r>
+    </w:p>
+    <w:p>
+      <w:pPr>
+        <w:shd w:fill="F0F4F8" w:val="clear"/>
+        <w:spacing w:after="0" w:before="0" w:line="276"/>
+        <w:ind w:left="360"/>
+      </w:pPr>
+      <w:r>
+        <w:rPr>
+          <w:rFonts w:ascii="Courier New" w:cs="Courier New" w:eastAsia="Courier New" w:hAnsi="Courier New"/>
+          <w:color w:val="1A1A1A"/>
+          <w:sz w:val="18"/>
+          <w:szCs w:val="18"/>
+        </w:rPr>
+        <w:t xml:space="preserve">start-agents.bat tokens       # show token audit stats</w:t>
       </w:r>
     </w:p>
     <w:p>
@@ -8582,7 +9046,7 @@
           <w:sz w:val="22"/>
           <w:szCs w:val="22"/>
         </w:rPr>
-        <w:t xml:space="preserve">Eight windows open:</w:t>
+        <w:t xml:space="preserve">In AutoRun mode agents launch in two phases: Phase 1 (Arjun, Vikram, Rasool, Kavya) starts immediately; Phase 2 (Kiran, Rohan) starts 15 seconds later after schema and token files are ready. Eight windows open:</w:t>
       </w:r>
     </w:p>
     <w:tbl>
@@ -9020,7 +9484,7 @@
                 <w:sz w:val="20"/>
                 <w:szCs w:val="20"/>
               </w:rPr>
-              <w:t xml:space="preserve">Claude Sonnet — UX Designer</w:t>
+              <w:t xml:space="preserve">Claude Haiku — UX Designer</w:t>
             </w:r>
           </w:p>
         </w:tc>
@@ -9392,7 +9856,24 @@
           <w:sz w:val="36"/>
           <w:szCs w:val="36"/>
         </w:rPr>
-        <w:t xml:space="preserve">14. Push to GitHub</w:t>
+        <w:t xml:space="preserve">14. Multi-Project Management</w:t>
+      </w:r>
+    </w:p>
+    <w:p>
+      <w:pPr>
+        <w:spacing w:after="60" w:before="60" w:line="276"/>
+        <w:jc w:val="left"/>
+      </w:pPr>
+      <w:r>
+        <w:rPr>
+          <w:rFonts w:ascii="Arial" w:cs="Arial" w:eastAsia="Arial" w:hAnsi="Arial"/>
+          <w:b w:val="false"/>
+          <w:bCs w:val="false"/>
+          <w:color w:val="111111"/>
+          <w:sz w:val="22"/>
+          <w:szCs w:val="22"/>
+        </w:rPr>
+        <w:t xml:space="preserve">ADLC v3.2 supports a queue of multiple requirements. Each requirement lives in its own isolated subfolder under projects\. The active-project.json pointer tells the launcher, dashboard, and dashboard server which project is currently live.</w:t>
       </w:r>
     </w:p>
     <w:p/>
@@ -9410,6 +9891,578 @@
           <w:sz w:val="28"/>
           <w:szCs w:val="28"/>
         </w:rPr>
+        <w:t xml:space="preserve">14.1 Project Folder Layout</w:t>
+      </w:r>
+    </w:p>
+    <w:p>
+      <w:pPr>
+        <w:shd w:fill="F0F4F8" w:val="clear"/>
+        <w:spacing w:after="0" w:before="0" w:line="276"/>
+        <w:ind w:left="360"/>
+      </w:pPr>
+      <w:r>
+        <w:rPr>
+          <w:rFonts w:ascii="Courier New" w:cs="Courier New" w:eastAsia="Courier New" w:hAnsi="Courier New"/>
+          <w:color w:val="1A1A1A"/>
+          <w:sz w:val="18"/>
+          <w:szCs w:val="18"/>
+        </w:rPr>
+        <w:t xml:space="preserve">ADLC-Agent-Kit\</w:t>
+      </w:r>
+    </w:p>
+    <w:p>
+      <w:pPr>
+        <w:shd w:fill="F0F4F8" w:val="clear"/>
+        <w:spacing w:after="0" w:before="0" w:line="276"/>
+        <w:ind w:left="360"/>
+      </w:pPr>
+      <w:r>
+        <w:rPr>
+          <w:rFonts w:ascii="Courier New" w:cs="Courier New" w:eastAsia="Courier New" w:hAnsi="Courier New"/>
+          <w:color w:val="1A1A1A"/>
+          <w:sz w:val="18"/>
+          <w:szCs w:val="18"/>
+        </w:rPr>
+        <w:t xml:space="preserve">  active-project.json          # pointer: which project is live</w:t>
+      </w:r>
+    </w:p>
+    <w:p>
+      <w:pPr>
+        <w:shd w:fill="F0F4F8" w:val="clear"/>
+        <w:spacing w:after="0" w:before="0" w:line="276"/>
+        <w:ind w:left="360"/>
+      </w:pPr>
+      <w:r>
+        <w:rPr>
+          <w:rFonts w:ascii="Courier New" w:cs="Courier New" w:eastAsia="Courier New" w:hAnsi="Courier New"/>
+          <w:color w:val="1A1A1A"/>
+          <w:sz w:val="18"/>
+          <w:szCs w:val="18"/>
+        </w:rPr>
+        <w:t xml:space="preserve">  projects\</w:t>
+      </w:r>
+    </w:p>
+    <w:p>
+      <w:pPr>
+        <w:shd w:fill="F0F4F8" w:val="clear"/>
+        <w:spacing w:after="0" w:before="0" w:line="276"/>
+        <w:ind w:left="360"/>
+      </w:pPr>
+      <w:r>
+        <w:rPr>
+          <w:rFonts w:ascii="Courier New" w:cs="Courier New" w:eastAsia="Courier New" w:hAnsi="Courier New"/>
+          <w:color w:val="1A1A1A"/>
+          <w:sz w:val="18"/>
+          <w:szCs w:val="18"/>
+        </w:rPr>
+        <w:t xml:space="preserve">    REQ-001-infraviz\           # project 1 (its own data files)</w:t>
+      </w:r>
+    </w:p>
+    <w:p>
+      <w:pPr>
+        <w:shd w:fill="F0F4F8" w:val="clear"/>
+        <w:spacing w:after="0" w:before="0" w:line="276"/>
+        <w:ind w:left="360"/>
+      </w:pPr>
+      <w:r>
+        <w:rPr>
+          <w:rFonts w:ascii="Courier New" w:cs="Courier New" w:eastAsia="Courier New" w:hAnsi="Courier New"/>
+          <w:color w:val="1A1A1A"/>
+          <w:sz w:val="18"/>
+          <w:szCs w:val="18"/>
+        </w:rPr>
+        <w:t xml:space="preserve">    REQ-002-cost-alerts\        # project 2 (queued, not yet started)</w:t>
+      </w:r>
+    </w:p>
+    <w:p>
+      <w:pPr>
+        <w:spacing w:after="60" w:before="60" w:line="276"/>
+        <w:jc w:val="left"/>
+      </w:pPr>
+      <w:r>
+        <w:rPr>
+          <w:rFonts w:ascii="Arial" w:cs="Arial" w:eastAsia="Arial" w:hAnsi="Arial"/>
+          <w:b w:val="false"/>
+          <w:bCs w:val="false"/>
+          <w:color w:val="111111"/>
+          <w:sz w:val="22"/>
+          <w:szCs w:val="22"/>
+        </w:rPr>
+        <w:t xml:space="preserve">Each project subfolder contains its own requirement.json, agent-status.json, group-chat.json, agent-logs\, and outputs\. The prompts\ folder and all static scripts remain at the kit root and are shared across projects.</w:t>
+      </w:r>
+    </w:p>
+    <w:p/>
+    <w:p>
+      <w:pPr>
+        <w:pStyle w:val="Heading2"/>
+        <w:spacing w:after="80" w:before="240" w:line="276"/>
+      </w:pPr>
+      <w:r>
+        <w:rPr>
+          <w:rFonts w:ascii="Arial" w:cs="Arial" w:eastAsia="Arial" w:hAnsi="Arial"/>
+          <w:b/>
+          <w:bCs/>
+          <w:color w:val="2E6DB4"/>
+          <w:sz w:val="28"/>
+          <w:szCs w:val="28"/>
+        </w:rPr>
+        <w:t xml:space="preserve">14.2 Workflow: One Requirement at a Time</w:t>
+      </w:r>
+    </w:p>
+    <w:tbl>
+      <w:tblPr>
+        <w:tblW w:type="dxa" w:w="9360"/>
+        <w:tblBorders>
+          <w:top w:val="single" w:color="auto" w:sz="4"/>
+          <w:left w:val="single" w:color="auto" w:sz="4"/>
+          <w:bottom w:val="single" w:color="auto" w:sz="4"/>
+          <w:right w:val="single" w:color="auto" w:sz="4"/>
+          <w:insideH w:val="single" w:color="auto" w:sz="4"/>
+          <w:insideV w:val="single" w:color="auto" w:sz="4"/>
+        </w:tblBorders>
+      </w:tblPr>
+      <w:tblGrid>
+        <w:gridCol w:w="720"/>
+        <w:gridCol w:w="8640"/>
+      </w:tblGrid>
+      <w:tr>
+        <w:tc>
+          <w:tcPr>
+            <w:tcW w:type="dxa" w:w="720"/>
+            <w:tcBorders>
+              <w:top w:val="single" w:color="2E6DB4" w:sz="1"/>
+              <w:left w:val="single" w:color="2E6DB4" w:sz="1"/>
+              <w:bottom w:val="single" w:color="2E6DB4" w:sz="1"/>
+              <w:right w:val="single" w:color="2E6DB4" w:sz="1"/>
+            </w:tcBorders>
+            <w:shd w:fill="2E6DB4" w:val="clear"/>
+            <w:tcMar>
+              <w:top w:type="dxa" w:w="80"/>
+              <w:left w:type="dxa" w:w="120"/>
+              <w:bottom w:type="dxa" w:w="80"/>
+              <w:right w:type="dxa" w:w="120"/>
+            </w:tcMar>
+          </w:tcPr>
+          <w:p>
+            <w:r>
+              <w:rPr>
+                <w:rFonts w:ascii="Arial" w:cs="Arial" w:eastAsia="Arial" w:hAnsi="Arial"/>
+                <w:b/>
+                <w:bCs/>
+                <w:color w:val="FFFFFF"/>
+                <w:sz w:val="20"/>
+                <w:szCs w:val="20"/>
+              </w:rPr>
+              <w:t xml:space="preserve">Step</w:t>
+            </w:r>
+          </w:p>
+        </w:tc>
+        <w:tc>
+          <w:tcPr>
+            <w:tcW w:type="dxa" w:w="8640"/>
+            <w:tcBorders>
+              <w:top w:val="single" w:color="2E6DB4" w:sz="1"/>
+              <w:left w:val="single" w:color="2E6DB4" w:sz="1"/>
+              <w:bottom w:val="single" w:color="2E6DB4" w:sz="1"/>
+              <w:right w:val="single" w:color="2E6DB4" w:sz="1"/>
+            </w:tcBorders>
+            <w:shd w:fill="2E6DB4" w:val="clear"/>
+            <w:tcMar>
+              <w:top w:type="dxa" w:w="80"/>
+              <w:left w:type="dxa" w:w="120"/>
+              <w:bottom w:type="dxa" w:w="80"/>
+              <w:right w:type="dxa" w:w="120"/>
+            </w:tcMar>
+          </w:tcPr>
+          <w:p>
+            <w:r>
+              <w:rPr>
+                <w:rFonts w:ascii="Arial" w:cs="Arial" w:eastAsia="Arial" w:hAnsi="Arial"/>
+                <w:b/>
+                <w:bCs/>
+                <w:color w:val="FFFFFF"/>
+                <w:sz w:val="20"/>
+                <w:szCs w:val="20"/>
+              </w:rPr>
+              <w:t xml:space="preserve">Action</w:t>
+            </w:r>
+          </w:p>
+        </w:tc>
+      </w:tr>
+      <w:tr>
+        <w:tc>
+          <w:tcPr>
+            <w:tcW w:type="dxa" w:w="720"/>
+            <w:tcBorders>
+              <w:top w:val="single" w:color="CCCCCC" w:sz="1"/>
+              <w:left w:val="single" w:color="CCCCCC" w:sz="1"/>
+              <w:bottom w:val="single" w:color="CCCCCC" w:sz="1"/>
+              <w:right w:val="single" w:color="CCCCCC" w:sz="1"/>
+            </w:tcBorders>
+            <w:shd w:fill="F5F5F5" w:val="clear"/>
+            <w:tcMar>
+              <w:top w:type="dxa" w:w="80"/>
+              <w:left w:type="dxa" w:w="120"/>
+              <w:bottom w:type="dxa" w:w="80"/>
+              <w:right w:type="dxa" w:w="120"/>
+            </w:tcMar>
+          </w:tcPr>
+          <w:p>
+            <w:r>
+              <w:rPr>
+                <w:rFonts w:ascii="Arial" w:cs="Arial" w:eastAsia="Arial" w:hAnsi="Arial"/>
+                <w:b/>
+                <w:bCs/>
+                <w:sz w:val="20"/>
+                <w:szCs w:val="20"/>
+              </w:rPr>
+              <w:t xml:space="preserve">1</w:t>
+            </w:r>
+          </w:p>
+        </w:tc>
+        <w:tc>
+          <w:tcPr>
+            <w:tcW w:type="dxa" w:w="8640"/>
+            <w:tcBorders>
+              <w:top w:val="single" w:color="CCCCCC" w:sz="1"/>
+              <w:left w:val="single" w:color="CCCCCC" w:sz="1"/>
+              <w:bottom w:val="single" w:color="CCCCCC" w:sz="1"/>
+              <w:right w:val="single" w:color="CCCCCC" w:sz="1"/>
+            </w:tcBorders>
+            <w:shd w:fill="F5F5F5" w:val="clear"/>
+            <w:tcMar>
+              <w:top w:type="dxa" w:w="80"/>
+              <w:left w:type="dxa" w:w="120"/>
+              <w:bottom w:type="dxa" w:w="80"/>
+              <w:right w:type="dxa" w:w="120"/>
+            </w:tcMar>
+          </w:tcPr>
+          <w:p>
+            <w:r>
+              <w:rPr>
+                <w:rFonts w:ascii="Arial" w:cs="Arial" w:eastAsia="Arial" w:hAnsi="Arial"/>
+                <w:sz w:val="20"/>
+                <w:szCs w:val="20"/>
+              </w:rPr>
+              <w:t xml:space="preserve">Run start-agents.bat new to create the first requirement. A subfolder projects\REQ-xxx-name\ is created and set as active.</w:t>
+            </w:r>
+          </w:p>
+        </w:tc>
+      </w:tr>
+      <w:tr>
+        <w:tc>
+          <w:tcPr>
+            <w:tcW w:type="dxa" w:w="720"/>
+            <w:tcBorders>
+              <w:top w:val="single" w:color="CCCCCC" w:sz="1"/>
+              <w:left w:val="single" w:color="CCCCCC" w:sz="1"/>
+              <w:bottom w:val="single" w:color="CCCCCC" w:sz="1"/>
+              <w:right w:val="single" w:color="CCCCCC" w:sz="1"/>
+            </w:tcBorders>
+            <w:shd w:fill="FFFFFF" w:val="clear"/>
+            <w:tcMar>
+              <w:top w:type="dxa" w:w="80"/>
+              <w:left w:type="dxa" w:w="120"/>
+              <w:bottom w:type="dxa" w:w="80"/>
+              <w:right w:type="dxa" w:w="120"/>
+            </w:tcMar>
+          </w:tcPr>
+          <w:p>
+            <w:r>
+              <w:rPr>
+                <w:rFonts w:ascii="Arial" w:cs="Arial" w:eastAsia="Arial" w:hAnsi="Arial"/>
+                <w:b/>
+                <w:bCs/>
+                <w:sz w:val="20"/>
+                <w:szCs w:val="20"/>
+              </w:rPr>
+              <w:t xml:space="preserve">2</w:t>
+            </w:r>
+          </w:p>
+        </w:tc>
+        <w:tc>
+          <w:tcPr>
+            <w:tcW w:type="dxa" w:w="8640"/>
+            <w:tcBorders>
+              <w:top w:val="single" w:color="CCCCCC" w:sz="1"/>
+              <w:left w:val="single" w:color="CCCCCC" w:sz="1"/>
+              <w:bottom w:val="single" w:color="CCCCCC" w:sz="1"/>
+              <w:right w:val="single" w:color="CCCCCC" w:sz="1"/>
+            </w:tcBorders>
+            <w:shd w:fill="FFFFFF" w:val="clear"/>
+            <w:tcMar>
+              <w:top w:type="dxa" w:w="80"/>
+              <w:left w:type="dxa" w:w="120"/>
+              <w:bottom w:type="dxa" w:w="80"/>
+              <w:right w:type="dxa" w:w="120"/>
+            </w:tcMar>
+          </w:tcPr>
+          <w:p>
+            <w:r>
+              <w:rPr>
+                <w:rFonts w:ascii="Arial" w:cs="Arial" w:eastAsia="Arial" w:hAnsi="Arial"/>
+                <w:sz w:val="20"/>
+                <w:szCs w:val="20"/>
+              </w:rPr>
+              <w:t xml:space="preserve">Run start-agents.bat autorun (or double-click) to launch all 8 windows for the active project.</w:t>
+            </w:r>
+          </w:p>
+        </w:tc>
+      </w:tr>
+      <w:tr>
+        <w:tc>
+          <w:tcPr>
+            <w:tcW w:type="dxa" w:w="720"/>
+            <w:tcBorders>
+              <w:top w:val="single" w:color="CCCCCC" w:sz="1"/>
+              <w:left w:val="single" w:color="CCCCCC" w:sz="1"/>
+              <w:bottom w:val="single" w:color="CCCCCC" w:sz="1"/>
+              <w:right w:val="single" w:color="CCCCCC" w:sz="1"/>
+            </w:tcBorders>
+            <w:shd w:fill="F5F5F5" w:val="clear"/>
+            <w:tcMar>
+              <w:top w:type="dxa" w:w="80"/>
+              <w:left w:type="dxa" w:w="120"/>
+              <w:bottom w:type="dxa" w:w="80"/>
+              <w:right w:type="dxa" w:w="120"/>
+            </w:tcMar>
+          </w:tcPr>
+          <w:p>
+            <w:r>
+              <w:rPr>
+                <w:rFonts w:ascii="Arial" w:cs="Arial" w:eastAsia="Arial" w:hAnsi="Arial"/>
+                <w:b/>
+                <w:bCs/>
+                <w:sz w:val="20"/>
+                <w:szCs w:val="20"/>
+              </w:rPr>
+              <w:t xml:space="preserve">3</w:t>
+            </w:r>
+          </w:p>
+        </w:tc>
+        <w:tc>
+          <w:tcPr>
+            <w:tcW w:type="dxa" w:w="8640"/>
+            <w:tcBorders>
+              <w:top w:val="single" w:color="CCCCCC" w:sz="1"/>
+              <w:left w:val="single" w:color="CCCCCC" w:sz="1"/>
+              <w:bottom w:val="single" w:color="CCCCCC" w:sz="1"/>
+              <w:right w:val="single" w:color="CCCCCC" w:sz="1"/>
+            </w:tcBorders>
+            <w:shd w:fill="F5F5F5" w:val="clear"/>
+            <w:tcMar>
+              <w:top w:type="dxa" w:w="80"/>
+              <w:left w:type="dxa" w:w="120"/>
+              <w:bottom w:type="dxa" w:w="80"/>
+              <w:right w:type="dxa" w:w="120"/>
+            </w:tcMar>
+          </w:tcPr>
+          <w:p>
+            <w:r>
+              <w:rPr>
+                <w:rFonts w:ascii="Arial" w:cs="Arial" w:eastAsia="Arial" w:hAnsi="Arial"/>
+                <w:sz w:val="20"/>
+                <w:szCs w:val="20"/>
+              </w:rPr>
+              <w:t xml:space="preserve">Monitor progress on the Sprint Board (http://localhost:3000). When all 6 agents reach done, an Approve &amp; Start Next button appears (pulsing green) on the Sprint Board.</w:t>
+            </w:r>
+          </w:p>
+        </w:tc>
+      </w:tr>
+      <w:tr>
+        <w:tc>
+          <w:tcPr>
+            <w:tcW w:type="dxa" w:w="720"/>
+            <w:tcBorders>
+              <w:top w:val="single" w:color="CCCCCC" w:sz="1"/>
+              <w:left w:val="single" w:color="CCCCCC" w:sz="1"/>
+              <w:bottom w:val="single" w:color="CCCCCC" w:sz="1"/>
+              <w:right w:val="single" w:color="CCCCCC" w:sz="1"/>
+            </w:tcBorders>
+            <w:shd w:fill="FFFFFF" w:val="clear"/>
+            <w:tcMar>
+              <w:top w:type="dxa" w:w="80"/>
+              <w:left w:type="dxa" w:w="120"/>
+              <w:bottom w:type="dxa" w:w="80"/>
+              <w:right w:type="dxa" w:w="120"/>
+            </w:tcMar>
+          </w:tcPr>
+          <w:p>
+            <w:r>
+              <w:rPr>
+                <w:rFonts w:ascii="Arial" w:cs="Arial" w:eastAsia="Arial" w:hAnsi="Arial"/>
+                <w:b/>
+                <w:bCs/>
+                <w:sz w:val="20"/>
+                <w:szCs w:val="20"/>
+              </w:rPr>
+              <w:t xml:space="preserve">4</w:t>
+            </w:r>
+          </w:p>
+        </w:tc>
+        <w:tc>
+          <w:tcPr>
+            <w:tcW w:type="dxa" w:w="8640"/>
+            <w:tcBorders>
+              <w:top w:val="single" w:color="CCCCCC" w:sz="1"/>
+              <w:left w:val="single" w:color="CCCCCC" w:sz="1"/>
+              <w:bottom w:val="single" w:color="CCCCCC" w:sz="1"/>
+              <w:right w:val="single" w:color="CCCCCC" w:sz="1"/>
+            </w:tcBorders>
+            <w:shd w:fill="FFFFFF" w:val="clear"/>
+            <w:tcMar>
+              <w:top w:type="dxa" w:w="80"/>
+              <w:left w:type="dxa" w:w="120"/>
+              <w:bottom w:type="dxa" w:w="80"/>
+              <w:right w:type="dxa" w:w="120"/>
+            </w:tcMar>
+          </w:tcPr>
+          <w:p>
+            <w:r>
+              <w:rPr>
+                <w:rFonts w:ascii="Arial" w:cs="Arial" w:eastAsia="Arial" w:hAnsi="Arial"/>
+                <w:sz w:val="20"/>
+                <w:szCs w:val="20"/>
+              </w:rPr>
+              <w:t xml:space="preserve">Click Approve &amp; Start Next on the Sprint Board to switch to the next queued project. The dashboard reloads automatically. Then run start-agents.bat autorun to launch agents for the new project.</w:t>
+            </w:r>
+          </w:p>
+        </w:tc>
+      </w:tr>
+      <w:tr>
+        <w:tc>
+          <w:tcPr>
+            <w:tcW w:type="dxa" w:w="720"/>
+            <w:tcBorders>
+              <w:top w:val="single" w:color="CCCCCC" w:sz="1"/>
+              <w:left w:val="single" w:color="CCCCCC" w:sz="1"/>
+              <w:bottom w:val="single" w:color="CCCCCC" w:sz="1"/>
+              <w:right w:val="single" w:color="CCCCCC" w:sz="1"/>
+            </w:tcBorders>
+            <w:shd w:fill="F5F5F5" w:val="clear"/>
+            <w:tcMar>
+              <w:top w:type="dxa" w:w="80"/>
+              <w:left w:type="dxa" w:w="120"/>
+              <w:bottom w:type="dxa" w:w="80"/>
+              <w:right w:type="dxa" w:w="120"/>
+            </w:tcMar>
+          </w:tcPr>
+          <w:p>
+            <w:r>
+              <w:rPr>
+                <w:rFonts w:ascii="Arial" w:cs="Arial" w:eastAsia="Arial" w:hAnsi="Arial"/>
+                <w:b/>
+                <w:bCs/>
+                <w:sz w:val="20"/>
+                <w:szCs w:val="20"/>
+              </w:rPr>
+              <w:t xml:space="preserve">5</w:t>
+            </w:r>
+          </w:p>
+        </w:tc>
+        <w:tc>
+          <w:tcPr>
+            <w:tcW w:type="dxa" w:w="8640"/>
+            <w:tcBorders>
+              <w:top w:val="single" w:color="CCCCCC" w:sz="1"/>
+              <w:left w:val="single" w:color="CCCCCC" w:sz="1"/>
+              <w:bottom w:val="single" w:color="CCCCCC" w:sz="1"/>
+              <w:right w:val="single" w:color="CCCCCC" w:sz="1"/>
+            </w:tcBorders>
+            <w:shd w:fill="F5F5F5" w:val="clear"/>
+            <w:tcMar>
+              <w:top w:type="dxa" w:w="80"/>
+              <w:left w:type="dxa" w:w="120"/>
+              <w:bottom w:type="dxa" w:w="80"/>
+              <w:right w:type="dxa" w:w="120"/>
+            </w:tcMar>
+          </w:tcPr>
+          <w:p>
+            <w:r>
+              <w:rPr>
+                <w:rFonts w:ascii="Arial" w:cs="Arial" w:eastAsia="Arial" w:hAnsi="Arial"/>
+                <w:sz w:val="20"/>
+                <w:szCs w:val="20"/>
+              </w:rPr>
+              <w:t xml:space="preserve">Repeat for each requirement. Previous project folders are preserved and can be revisited at any time with start-agents.bat switch "projects\REQ-xxx".</w:t>
+            </w:r>
+          </w:p>
+        </w:tc>
+      </w:tr>
+    </w:tbl>
+    <w:p/>
+    <w:p>
+      <w:pPr>
+        <w:pStyle w:val="Heading2"/>
+        <w:spacing w:after="80" w:before="240" w:line="276"/>
+      </w:pPr>
+      <w:r>
+        <w:rPr>
+          <w:rFonts w:ascii="Arial" w:cs="Arial" w:eastAsia="Arial" w:hAnsi="Arial"/>
+          <w:b/>
+          <w:bCs/>
+          <w:color w:val="2E6DB4"/>
+          <w:sz w:val="28"/>
+          <w:szCs w:val="28"/>
+        </w:rPr>
+        <w:t xml:space="preserve">14.3 Sprint Board Project Switcher</w:t>
+      </w:r>
+    </w:p>
+    <w:p>
+      <w:pPr>
+        <w:spacing w:after="60" w:before="60" w:line="276"/>
+        <w:jc w:val="left"/>
+      </w:pPr>
+      <w:r>
+        <w:rPr>
+          <w:rFonts w:ascii="Arial" w:cs="Arial" w:eastAsia="Arial" w:hAnsi="Arial"/>
+          <w:b w:val="false"/>
+          <w:bCs w:val="false"/>
+          <w:color w:val="111111"/>
+          <w:sz w:val="22"/>
+          <w:szCs w:val="22"/>
+        </w:rPr>
+        <w:t xml:space="preserve">The Sprint Board top bar includes a project dropdown and an Approve &amp; Start Next button. The dropdown lists all known projects and lets you switch context instantly without restarting any servers. The Approve &amp; Start Next button only appears (pulsing green) when every agent on the current project has status done. Clicking it marks the current project complete, advances the pointer to the next queued project, and broadcasts a reload event to all connected dashboards.</w:t>
+      </w:r>
+    </w:p>
+    <w:p/>
+    <w:p>
+      <w:r>
+        <w:br w:type="page"/>
+      </w:r>
+    </w:p>
+    <w:p>
+      <w:pPr>
+        <w:pStyle w:val="Heading1"/>
+        <w:spacing w:after="120" w:before="360" w:line="276"/>
+      </w:pPr>
+      <w:r>
+        <w:rPr>
+          <w:rFonts w:ascii="Arial" w:cs="Arial" w:eastAsia="Arial" w:hAnsi="Arial"/>
+          <w:b/>
+          <w:bCs/>
+          <w:color w:val="1B3A6B"/>
+          <w:sz w:val="36"/>
+          <w:szCs w:val="36"/>
+        </w:rPr>
+        <w:t xml:space="preserve">15. Push to GitHub</w:t>
+      </w:r>
+    </w:p>
+    <w:p/>
+    <w:p>
+      <w:pPr>
+        <w:pStyle w:val="Heading2"/>
+        <w:spacing w:after="80" w:before="240" w:line="276"/>
+      </w:pPr>
+      <w:r>
+        <w:rPr>
+          <w:rFonts w:ascii="Arial" w:cs="Arial" w:eastAsia="Arial" w:hAnsi="Arial"/>
+          <w:b/>
+          <w:bCs/>
+          <w:color w:val="2E6DB4"/>
+          <w:sz w:val="28"/>
+          <w:szCs w:val="28"/>
+        </w:rPr>
         <w:t xml:space="preserve">14.1 Initialise Repository</w:t>
       </w:r>
     </w:p>
@@ -9474,7 +10527,7 @@
           <w:sz w:val="18"/>
           <w:szCs w:val="18"/>
         </w:rPr>
-        <w:t xml:space="preserve">git commit -m "Initial commit — ADLC Agent Kit v2.0"</w:t>
+        <w:t xml:space="preserve">git commit -m "Initial commit — ADLC Agent Kit v3.2"</w:t>
       </w:r>
     </w:p>
     <w:p/>
@@ -9729,7 +10782,7 @@
           <w:sz w:val="36"/>
           <w:szCs w:val="36"/>
         </w:rPr>
-        <w:t xml:space="preserve">15. AWS Tagging Standards</w:t>
+        <w:t xml:space="preserve">16. AWS Tagging Standards</w:t>
       </w:r>
     </w:p>
     <w:p>
@@ -10140,7 +11193,7 @@
           <w:sz w:val="36"/>
           <w:szCs w:val="36"/>
         </w:rPr>
-        <w:t xml:space="preserve">16. Quick Reference Card</w:t>
+        <w:t xml:space="preserve">17. Quick Reference Card</w:t>
       </w:r>
     </w:p>
     <w:p/>
@@ -10268,7 +11321,7 @@
                 <w:sz w:val="18"/>
                 <w:szCs w:val="18"/>
               </w:rPr>
-              <w:t xml:space="preserve">.\start-agents.ps1</w:t>
+              <w:t xml:space="preserve">start-agents.bat autorun</w:t>
             </w:r>
           </w:p>
         </w:tc>
@@ -10296,7 +11349,7 @@
                 <w:sz w:val="20"/>
                 <w:szCs w:val="20"/>
               </w:rPr>
-              <w:t xml:space="preserve">Launch all 8 agent windows</w:t>
+              <w:t xml:space="preserve">Launch all 8 agent windows (AutoRun mode)</w:t>
             </w:r>
           </w:p>
         </w:tc>
@@ -11197,6 +12250,186 @@
                 <w:szCs w:val="20"/>
               </w:rPr>
               <w:t xml:space="preserve">Test GitHub connection</w:t>
+            </w:r>
+          </w:p>
+        </w:tc>
+      </w:tr>
+      <w:tr>
+        <w:tc>
+          <w:tcPr>
+            <w:tcW w:type="dxa" w:w="3000"/>
+            <w:tcBorders>
+              <w:top w:val="single" w:color="CCCCCC" w:sz="1"/>
+              <w:left w:val="single" w:color="CCCCCC" w:sz="1"/>
+              <w:bottom w:val="single" w:color="CCCCCC" w:sz="1"/>
+              <w:right w:val="single" w:color="CCCCCC" w:sz="1"/>
+            </w:tcBorders>
+            <w:shd w:fill="F5F5F5" w:val="clear"/>
+            <w:tcMar>
+              <w:top w:type="dxa" w:w="80"/>
+              <w:left w:type="dxa" w:w="120"/>
+              <w:bottom w:type="dxa" w:w="80"/>
+              <w:right w:type="dxa" w:w="120"/>
+            </w:tcMar>
+          </w:tcPr>
+          <w:p>
+            <w:r>
+              <w:rPr>
+                <w:rFonts w:ascii="Courier New" w:cs="Courier New" w:eastAsia="Courier New" w:hAnsi="Courier New"/>
+                <w:b/>
+                <w:bCs/>
+                <w:sz w:val="18"/>
+                <w:szCs w:val="18"/>
+              </w:rPr>
+              <w:t xml:space="preserve">start-agents.bat new</w:t>
+            </w:r>
+          </w:p>
+        </w:tc>
+        <w:tc>
+          <w:tcPr>
+            <w:tcW w:type="dxa" w:w="6360"/>
+            <w:tcBorders>
+              <w:top w:val="single" w:color="CCCCCC" w:sz="1"/>
+              <w:left w:val="single" w:color="CCCCCC" w:sz="1"/>
+              <w:bottom w:val="single" w:color="CCCCCC" w:sz="1"/>
+              <w:right w:val="single" w:color="CCCCCC" w:sz="1"/>
+            </w:tcBorders>
+            <w:shd w:fill="F5F5F5" w:val="clear"/>
+            <w:tcMar>
+              <w:top w:type="dxa" w:w="80"/>
+              <w:left w:type="dxa" w:w="120"/>
+              <w:bottom w:type="dxa" w:w="80"/>
+              <w:right w:type="dxa" w:w="120"/>
+            </w:tcMar>
+          </w:tcPr>
+          <w:p>
+            <w:r>
+              <w:rPr>
+                <w:rFonts w:ascii="Arial" w:cs="Arial" w:eastAsia="Arial" w:hAnsi="Arial"/>
+                <w:sz w:val="20"/>
+                <w:szCs w:val="20"/>
+              </w:rPr>
+              <w:t xml:space="preserve">Create new requirement (scaffolds projects\REQ-xxx\ subfolder)</w:t>
+            </w:r>
+          </w:p>
+        </w:tc>
+      </w:tr>
+      <w:tr>
+        <w:tc>
+          <w:tcPr>
+            <w:tcW w:type="dxa" w:w="3000"/>
+            <w:tcBorders>
+              <w:top w:val="single" w:color="CCCCCC" w:sz="1"/>
+              <w:left w:val="single" w:color="CCCCCC" w:sz="1"/>
+              <w:bottom w:val="single" w:color="CCCCCC" w:sz="1"/>
+              <w:right w:val="single" w:color="CCCCCC" w:sz="1"/>
+            </w:tcBorders>
+            <w:shd w:fill="FFFFFF" w:val="clear"/>
+            <w:tcMar>
+              <w:top w:type="dxa" w:w="80"/>
+              <w:left w:type="dxa" w:w="120"/>
+              <w:bottom w:type="dxa" w:w="80"/>
+              <w:right w:type="dxa" w:w="120"/>
+            </w:tcMar>
+          </w:tcPr>
+          <w:p>
+            <w:r>
+              <w:rPr>
+                <w:rFonts w:ascii="Courier New" w:cs="Courier New" w:eastAsia="Courier New" w:hAnsi="Courier New"/>
+                <w:b/>
+                <w:bCs/>
+                <w:sz w:val="18"/>
+                <w:szCs w:val="18"/>
+              </w:rPr>
+              <w:t xml:space="preserve">start-agents.bat list</w:t>
+            </w:r>
+          </w:p>
+        </w:tc>
+        <w:tc>
+          <w:tcPr>
+            <w:tcW w:type="dxa" w:w="6360"/>
+            <w:tcBorders>
+              <w:top w:val="single" w:color="CCCCCC" w:sz="1"/>
+              <w:left w:val="single" w:color="CCCCCC" w:sz="1"/>
+              <w:bottom w:val="single" w:color="CCCCCC" w:sz="1"/>
+              <w:right w:val="single" w:color="CCCCCC" w:sz="1"/>
+            </w:tcBorders>
+            <w:shd w:fill="FFFFFF" w:val="clear"/>
+            <w:tcMar>
+              <w:top w:type="dxa" w:w="80"/>
+              <w:left w:type="dxa" w:w="120"/>
+              <w:bottom w:type="dxa" w:w="80"/>
+              <w:right w:type="dxa" w:w="120"/>
+            </w:tcMar>
+          </w:tcPr>
+          <w:p>
+            <w:r>
+              <w:rPr>
+                <w:rFonts w:ascii="Arial" w:cs="Arial" w:eastAsia="Arial" w:hAnsi="Arial"/>
+                <w:sz w:val="20"/>
+                <w:szCs w:val="20"/>
+              </w:rPr>
+              <w:t xml:space="preserve">List all projects and their status</w:t>
+            </w:r>
+          </w:p>
+        </w:tc>
+      </w:tr>
+      <w:tr>
+        <w:tc>
+          <w:tcPr>
+            <w:tcW w:type="dxa" w:w="3000"/>
+            <w:tcBorders>
+              <w:top w:val="single" w:color="CCCCCC" w:sz="1"/>
+              <w:left w:val="single" w:color="CCCCCC" w:sz="1"/>
+              <w:bottom w:val="single" w:color="CCCCCC" w:sz="1"/>
+              <w:right w:val="single" w:color="CCCCCC" w:sz="1"/>
+            </w:tcBorders>
+            <w:shd w:fill="F5F5F5" w:val="clear"/>
+            <w:tcMar>
+              <w:top w:type="dxa" w:w="80"/>
+              <w:left w:type="dxa" w:w="120"/>
+              <w:bottom w:type="dxa" w:w="80"/>
+              <w:right w:type="dxa" w:w="120"/>
+            </w:tcMar>
+          </w:tcPr>
+          <w:p>
+            <w:r>
+              <w:rPr>
+                <w:rFonts w:ascii="Courier New" w:cs="Courier New" w:eastAsia="Courier New" w:hAnsi="Courier New"/>
+                <w:b/>
+                <w:bCs/>
+                <w:sz w:val="18"/>
+                <w:szCs w:val="18"/>
+              </w:rPr>
+              <w:t xml:space="preserve">start-agents.bat switch "projects\REQ-xxx"</w:t>
+            </w:r>
+          </w:p>
+        </w:tc>
+        <w:tc>
+          <w:tcPr>
+            <w:tcW w:type="dxa" w:w="6360"/>
+            <w:tcBorders>
+              <w:top w:val="single" w:color="CCCCCC" w:sz="1"/>
+              <w:left w:val="single" w:color="CCCCCC" w:sz="1"/>
+              <w:bottom w:val="single" w:color="CCCCCC" w:sz="1"/>
+              <w:right w:val="single" w:color="CCCCCC" w:sz="1"/>
+            </w:tcBorders>
+            <w:shd w:fill="F5F5F5" w:val="clear"/>
+            <w:tcMar>
+              <w:top w:type="dxa" w:w="80"/>
+              <w:left w:type="dxa" w:w="120"/>
+              <w:bottom w:type="dxa" w:w="80"/>
+              <w:right w:type="dxa" w:w="120"/>
+            </w:tcMar>
+          </w:tcPr>
+          <w:p>
+            <w:r>
+              <w:rPr>
+                <w:rFonts w:ascii="Arial" w:cs="Arial" w:eastAsia="Arial" w:hAnsi="Arial"/>
+                <w:sz w:val="20"/>
+                <w:szCs w:val="20"/>
+              </w:rPr>
+              <w:t xml:space="preserve">Switch the active project (dashboard reloads automatically)</w:t>
             </w:r>
           </w:p>
         </w:tc>
@@ -11561,7 +12794,7 @@
           <w:sz w:val="36"/>
           <w:szCs w:val="36"/>
         </w:rPr>
-        <w:t xml:space="preserve">17. Troubleshooting</w:t>
+        <w:t xml:space="preserve">18. Troubleshooting</w:t>
       </w:r>
     </w:p>
     <w:p/>
@@ -11683,6 +12916,95 @@
           <w:szCs w:val="22"/>
         </w:rPr>
         <w:t xml:space="preserve">Re-install Claude Code: npm install -g @anthropic-ai/claude-code</w:t>
+      </w:r>
+    </w:p>
+    <w:p/>
+    <w:p>
+      <w:pPr>
+        <w:pStyle w:val="Heading2"/>
+        <w:spacing w:after="80" w:before="240" w:line="276"/>
+      </w:pPr>
+      <w:r>
+        <w:rPr>
+          <w:rFonts w:ascii="Arial" w:cs="Arial" w:eastAsia="Arial" w:hAnsi="Arial"/>
+          <w:b/>
+          <w:bCs/>
+          <w:color w:val="2E6DB4"/>
+          <w:sz w:val="28"/>
+          <w:szCs w:val="28"/>
+        </w:rPr>
+        <w:t xml:space="preserve">Agent window shows "Raw mode is not supported on the current process.stdin"</w:t>
+      </w:r>
+    </w:p>
+    <w:p>
+      <w:pPr>
+        <w:spacing w:after="60" w:before="60" w:line="276"/>
+        <w:jc w:val="left"/>
+      </w:pPr>
+      <w:r>
+        <w:rPr>
+          <w:rFonts w:ascii="Arial" w:cs="Arial" w:eastAsia="Arial" w:hAnsi="Arial"/>
+          <w:b w:val="false"/>
+          <w:bCs w:val="false"/>
+          <w:color w:val="111111"/>
+          <w:sz w:val="22"/>
+          <w:szCs w:val="22"/>
+        </w:rPr>
+        <w:t xml:space="preserve">This error means the agent was started with its prompt piped through stdin (e.g. $p | claude), which replaces the TTY with a pipe handle. Claude Code’s Ink UI requires a real TTY. This is fixed in v3.2 — the launcher now passes the prompt as a command argument using the -p flag instead of piping. Solutions:</w:t>
+      </w:r>
+    </w:p>
+    <w:p>
+      <w:pPr>
+        <w:pStyle w:val="ListParagraph"/>
+        <w:numPr>
+          <w:ilvl w:val="0"/>
+          <w:numId w:val="3"/>
+        </w:numPr>
+        <w:spacing w:after="60" w:before="60" w:line="276"/>
+      </w:pPr>
+      <w:r>
+        <w:rPr>
+          <w:rFonts w:ascii="Arial" w:cs="Arial" w:eastAsia="Arial" w:hAnsi="Arial"/>
+          <w:sz w:val="22"/>
+          <w:szCs w:val="22"/>
+        </w:rPr>
+        <w:t xml:space="preserve">Ensure you are running start-agents.bat v3.2 (not an older start-agents.ps1). Double-click start-agents.bat to launch.</w:t>
+      </w:r>
+    </w:p>
+    <w:p>
+      <w:pPr>
+        <w:pStyle w:val="ListParagraph"/>
+        <w:numPr>
+          <w:ilvl w:val="0"/>
+          <w:numId w:val="3"/>
+        </w:numPr>
+        <w:spacing w:after="60" w:before="60" w:line="276"/>
+      </w:pPr>
+      <w:r>
+        <w:rPr>
+          <w:rFonts w:ascii="Arial" w:cs="Arial" w:eastAsia="Arial" w:hAnsi="Arial"/>
+          <w:sz w:val="22"/>
+          <w:szCs w:val="22"/>
+        </w:rPr>
+        <w:t xml:space="preserve">If calling the PowerShell script directly, verify the AutoRun section uses: claude --dangerously-skip-permissions --model $Model -p $p (with -p, not a pipe).</w:t>
+      </w:r>
+    </w:p>
+    <w:p>
+      <w:pPr>
+        <w:pStyle w:val="ListParagraph"/>
+        <w:numPr>
+          <w:ilvl w:val="0"/>
+          <w:numId w:val="3"/>
+        </w:numPr>
+        <w:spacing w:after="60" w:before="60" w:line="276"/>
+      </w:pPr>
+      <w:r>
+        <w:rPr>
+          <w:rFonts w:ascii="Arial" w:cs="Arial" w:eastAsia="Arial" w:hAnsi="Arial"/>
+          <w:sz w:val="22"/>
+          <w:szCs w:val="22"/>
+        </w:rPr>
+        <w:t xml:space="preserve">If you see garbled characters or parser errors in PS1 scripts, run: python -c "d=open(’start-agents.ps1’,’rb’).read(); print(sum(1 for b in d if b&gt;127))" — any non-zero result means the file has non-ASCII bytes. Re-download from the kit or run setup-workspace.bat again.</w:t>
       </w:r>
     </w:p>
     <w:p/>
@@ -20054,7 +21376,7 @@
           <w:sz w:val="22"/>
           <w:szCs w:val="22"/>
         </w:rPr>
-        <w:t xml:space="preserve">ADLC Agent Kit v3.0 — Team Panchayat</w:t>
+        <w:t xml:space="preserve">ADLC Agent Kit v3.2 — Team Panchayat</w:t>
       </w:r>
     </w:p>
     <w:p>

</xml_diff>